<commit_message>
Add Zenodo DOI and final submission polish
</commit_message>
<xml_diff>
--- a/journal_submission/cover_letter_cnp.docx
+++ b/journal_submission/cover_letter_cnp.docx
@@ -37,7 +37,7 @@
     </w:p>
     <w:p>
       <w:r>
-        <w:t>The data are publicly available through OpenNeuro. Analysis code and derived manuscript materials are available at https://github.com/blakepi/openneuro-tbi-eeg-biomarker-reanalysis. Raw EEG data are not redistributed. No new human participant data were collected for this secondary analysis, which used publicly available, deidentified data and was considered exempt from institutional review board review.</w:t>
+        <w:t>The data are publicly available through OpenNeuro. Analysis code and derived manuscript materials are available at https://github.com/blakepi/openneuro-tbi-eeg-biomarker-reanalysis and archived on Zenodo (DOI: 10.5281/zenodo.20682573). Raw EEG data are not redistributed. This secondary analysis used publicly available, deidentified data and was considered exempt from institutional review board review.</w:t>
       </w:r>
     </w:p>
     <w:p>
@@ -68,12 +68,9 @@
         <w:t>Email: pierpogb@odu.edu</w:t>
       </w:r>
     </w:p>
-    <w:p>
-      <w:r>
-        <w:t>ORCID: https://orcid.org/0000-0001-8288-8549</w:t>
-      </w:r>
-    </w:p>
     <w:sectPr>
+      <w:headerReference w:type="default" r:id="rId9"/>
+      <w:footerReference w:type="default" r:id="rId10"/>
       <w:pgSz w:w="12240" w:h="15840"/>
       <w:pgMar w:top="1440" w:right="1440" w:bottom="1440" w:left="1440" w:header="720" w:footer="720" w:gutter="0"/>
       <w:cols w:space="720"/>
@@ -81,6 +78,26 @@
     </w:sectPr>
   </w:body>
 </w:document>
+</file>
+
+<file path=word/footer1.xml><?xml version="1.0" encoding="utf-8"?>
+<w:ftr xmlns:m="http://schemas.openxmlformats.org/officeDocument/2006/math" xmlns:mc="http://schemas.openxmlformats.org/markup-compatibility/2006" xmlns:mo="http://schemas.microsoft.com/office/mac/office/2008/main" xmlns:mv="urn:schemas-microsoft-com:mac:vml" xmlns:o="urn:schemas-microsoft-com:office:office" xmlns:r="http://schemas.openxmlformats.org/officeDocument/2006/relationships" xmlns:v="urn:schemas-microsoft-com:vml" xmlns:w10="urn:schemas-microsoft-com:office:word" xmlns:w14="http://schemas.microsoft.com/office/word/2010/wordml" xmlns:w="http://schemas.openxmlformats.org/wordprocessingml/2006/main" xmlns:wne="http://schemas.microsoft.com/office/word/2006/wordml" xmlns:wp14="http://schemas.microsoft.com/office/word/2010/wordprocessingDrawing" xmlns:wp="http://schemas.openxmlformats.org/drawingml/2006/wordprocessingDrawing" xmlns:wpc="http://schemas.microsoft.com/office/word/2010/wordprocessingCanvas" xmlns:wpg="http://schemas.microsoft.com/office/word/2010/wordprocessingGroup" xmlns:wpi="http://schemas.microsoft.com/office/word/2010/wordprocessingInk" xmlns:wps="http://schemas.microsoft.com/office/word/2010/wordprocessingShape" mc:Ignorable="w14 wp14">
+  <w:p>
+    <w:pPr>
+      <w:pStyle w:val="Footer"/>
+    </w:pPr>
+  </w:p>
+</w:ftr>
+</file>
+
+<file path=word/header1.xml><?xml version="1.0" encoding="utf-8"?>
+<w:hdr xmlns:m="http://schemas.openxmlformats.org/officeDocument/2006/math" xmlns:mc="http://schemas.openxmlformats.org/markup-compatibility/2006" xmlns:mo="http://schemas.microsoft.com/office/mac/office/2008/main" xmlns:mv="urn:schemas-microsoft-com:mac:vml" xmlns:o="urn:schemas-microsoft-com:office:office" xmlns:r="http://schemas.openxmlformats.org/officeDocument/2006/relationships" xmlns:v="urn:schemas-microsoft-com:vml" xmlns:w10="urn:schemas-microsoft-com:office:word" xmlns:w14="http://schemas.microsoft.com/office/word/2010/wordml" xmlns:w="http://schemas.openxmlformats.org/wordprocessingml/2006/main" xmlns:wne="http://schemas.microsoft.com/office/word/2006/wordml" xmlns:wp14="http://schemas.microsoft.com/office/word/2010/wordprocessingDrawing" xmlns:wp="http://schemas.openxmlformats.org/drawingml/2006/wordprocessingDrawing" xmlns:wpc="http://schemas.microsoft.com/office/word/2010/wordprocessingCanvas" xmlns:wpg="http://schemas.microsoft.com/office/word/2010/wordprocessingGroup" xmlns:wpi="http://schemas.microsoft.com/office/word/2010/wordprocessingInk" xmlns:wps="http://schemas.microsoft.com/office/word/2010/wordprocessingShape" mc:Ignorable="w14 wp14">
+  <w:p>
+    <w:pPr>
+      <w:pStyle w:val="Header"/>
+    </w:pPr>
+  </w:p>
+</w:hdr>
 </file>
 
 <file path=word/numbering.xml><?xml version="1.0" encoding="utf-8"?>

</xml_diff>